<commit_message>
fix(msword): detect lists when numbering is defined in paragraph styles
Signed-off-by: Cesar Berrospi Ramis <ceb@zurich.ibm.com>
</commit_message>
<xml_diff>
--- a/tests/data/docx/docx_lists.docx
+++ b/tests/data/docx/docx_lists.docx
@@ -643,6 +643,197 @@
       </w:pPr>
       <w:r>
         <w:t>Single item of a new list</w:t>
+      </w:r>
+    </w:p>
+    <w:p/>
+    <w:p>
+      <w:pPr>
+        <w:pStyle w:val="Heading3"/>
+      </w:pPr>
+      <w:r>
+        <w:t>Style-based lists</w:t>
+      </w:r>
+      <w:r>
+        <w:t>:</w:t>
+      </w:r>
+      <w:r>
+        <w:t xml:space="preserve"> </w:t>
+      </w:r>
+    </w:p>
+    <w:p>
+      <w:pPr>
+        <w:rPr>
+          <w:i/>
+          <w:color w:val="0070C0"/>
+        </w:rPr>
+      </w:pPr>
+      <w:r>
+        <w:t xml:space="preserve"> </w:t>
+      </w:r>
+      <w:proofErr w:type="spellStart"/>
+      <w:r>
+        <w:rPr>
+          <w:i/>
+          <w:color w:val="0070C0"/>
+        </w:rPr>
+        <w:t>Docling</w:t>
+      </w:r>
+      <w:proofErr w:type="spellEnd"/>
+      <w:r>
+        <w:rPr>
+          <w:i/>
+          <w:color w:val="0070C0"/>
+        </w:rPr>
+        <w:t xml:space="preserve"> </w:t>
+      </w:r>
+      <w:r>
+        <w:rPr>
+          <w:i/>
+          <w:color w:val="0070C0"/>
+        </w:rPr>
+        <w:t xml:space="preserve">should </w:t>
+      </w:r>
+      <w:r>
+        <w:rPr>
+          <w:i/>
+          <w:color w:val="0070C0"/>
+        </w:rPr>
+        <w:t>extract the list format when the formatting comes from the styles</w:t>
+      </w:r>
+      <w:r>
+        <w:rPr>
+          <w:i/>
+          <w:color w:val="0070C0"/>
+        </w:rPr>
+        <w:t>:</w:t>
+      </w:r>
+    </w:p>
+    <w:p>
+      <w:pPr>
+        <w:pStyle w:val="ListBullet"/>
+        <w:tabs>
+          <w:tab w:val="num" w:pos="720"/>
+        </w:tabs>
+        <w:ind w:left="1080" w:hanging="360"/>
+        <w:rPr>
+          <w:i/>
+          <w:color w:val="0070C0"/>
+        </w:rPr>
+      </w:pPr>
+      <w:r>
+        <w:rPr>
+          <w:i/>
+          <w:color w:val="0070C0"/>
+        </w:rPr>
+        <w:t>First item</w:t>
+      </w:r>
+    </w:p>
+    <w:p>
+      <w:pPr>
+        <w:pStyle w:val="ListBullet"/>
+        <w:tabs>
+          <w:tab w:val="num" w:pos="720"/>
+        </w:tabs>
+        <w:ind w:left="1080" w:hanging="360"/>
+        <w:rPr>
+          <w:i/>
+          <w:color w:val="0070C0"/>
+        </w:rPr>
+      </w:pPr>
+      <w:r>
+        <w:rPr>
+          <w:i/>
+          <w:color w:val="0070C0"/>
+        </w:rPr>
+        <w:t>Second item</w:t>
+      </w:r>
+    </w:p>
+    <w:p>
+      <w:pPr>
+        <w:pStyle w:val="ListBullet"/>
+        <w:tabs>
+          <w:tab w:val="num" w:pos="720"/>
+        </w:tabs>
+        <w:ind w:left="1080" w:hanging="360"/>
+        <w:rPr>
+          <w:i/>
+          <w:color w:val="0070C0"/>
+        </w:rPr>
+      </w:pPr>
+      <w:r>
+        <w:rPr>
+          <w:i/>
+          <w:color w:val="0070C0"/>
+        </w:rPr>
+        <w:t>Third item</w:t>
+      </w:r>
+    </w:p>
+    <w:p>
+      <w:pPr>
+        <w:pStyle w:val="ListBullet"/>
+        <w:numPr>
+          <w:ilvl w:val="1"/>
+          <w:numId w:val="7"/>
+        </w:numPr>
+        <w:tabs>
+          <w:tab w:val="clear" w:pos="1080"/>
+          <w:tab w:val="num" w:pos="720"/>
+        </w:tabs>
+        <w:rPr>
+          <w:i/>
+          <w:color w:val="0070C0"/>
+        </w:rPr>
+      </w:pPr>
+      <w:r>
+        <w:rPr>
+          <w:i/>
+          <w:color w:val="0070C0"/>
+        </w:rPr>
+        <w:t>Sub-item A</w:t>
+      </w:r>
+    </w:p>
+    <w:p>
+      <w:pPr>
+        <w:pStyle w:val="ListBullet"/>
+        <w:numPr>
+          <w:ilvl w:val="1"/>
+          <w:numId w:val="7"/>
+        </w:numPr>
+        <w:tabs>
+          <w:tab w:val="clear" w:pos="1080"/>
+          <w:tab w:val="num" w:pos="720"/>
+        </w:tabs>
+        <w:rPr>
+          <w:i/>
+          <w:color w:val="0070C0"/>
+        </w:rPr>
+      </w:pPr>
+      <w:r>
+        <w:rPr>
+          <w:i/>
+          <w:color w:val="0070C0"/>
+        </w:rPr>
+        <w:t>Sub-item B</w:t>
+      </w:r>
+    </w:p>
+    <w:p>
+      <w:pPr>
+        <w:pStyle w:val="ListBullet"/>
+        <w:tabs>
+          <w:tab w:val="num" w:pos="720"/>
+        </w:tabs>
+        <w:ind w:left="1080" w:hanging="360"/>
+        <w:rPr>
+          <w:i/>
+          <w:color w:val="0070C0"/>
+        </w:rPr>
+      </w:pPr>
+      <w:r>
+        <w:rPr>
+          <w:i/>
+          <w:color w:val="0070C0"/>
+        </w:rPr>
+        <w:t>Fourth item</w:t>
       </w:r>
     </w:p>
     <w:p/>
@@ -861,6 +1052,150 @@
     </w:lvl>
   </w:abstractNum>
   <w:abstractNum w:abstractNumId="2" w15:restartNumberingAfterBreak="0">
+    <w:nsid w:val="194F2290"/>
+    <w:multiLevelType w:val="multilevel"/>
+    <w:tmpl w:val="25268544"/>
+    <w:lvl w:ilvl="0">
+      <w:start w:val="1"/>
+      <w:numFmt w:val="bullet"/>
+      <w:pStyle w:val="ListBullet"/>
+      <w:lvlText w:val=""/>
+      <w:lvlJc w:val="left"/>
+      <w:pPr>
+        <w:tabs>
+          <w:tab w:val="num" w:pos="720"/>
+        </w:tabs>
+        <w:ind w:left="1080" w:hanging="360"/>
+      </w:pPr>
+      <w:rPr>
+        <w:rFonts w:ascii="Symbol" w:hAnsi="Symbol" w:hint="default"/>
+        <w:b/>
+        <w:i w:val="0"/>
+        <w:color w:val="616161"/>
+      </w:rPr>
+    </w:lvl>
+    <w:lvl w:ilvl="1">
+      <w:start w:val="1"/>
+      <w:numFmt w:val="bullet"/>
+      <w:lvlText w:val="–"/>
+      <w:lvlJc w:val="left"/>
+      <w:pPr>
+        <w:tabs>
+          <w:tab w:val="num" w:pos="1080"/>
+        </w:tabs>
+        <w:ind w:left="1440" w:hanging="360"/>
+      </w:pPr>
+      <w:rPr>
+        <w:rFonts w:ascii="Arial" w:hAnsi="Arial" w:hint="default"/>
+      </w:rPr>
+    </w:lvl>
+    <w:lvl w:ilvl="2">
+      <w:start w:val="1"/>
+      <w:numFmt w:val="bullet"/>
+      <w:lvlText w:val="◦"/>
+      <w:lvlJc w:val="left"/>
+      <w:pPr>
+        <w:tabs>
+          <w:tab w:val="num" w:pos="1440"/>
+        </w:tabs>
+        <w:ind w:left="1800" w:hanging="360"/>
+      </w:pPr>
+      <w:rPr>
+        <w:rFonts w:ascii="Calibri" w:hAnsi="Calibri" w:hint="default"/>
+      </w:rPr>
+    </w:lvl>
+    <w:lvl w:ilvl="3">
+      <w:start w:val="1"/>
+      <w:numFmt w:val="bullet"/>
+      <w:lvlText w:val=""/>
+      <w:lvlJc w:val="left"/>
+      <w:pPr>
+        <w:tabs>
+          <w:tab w:val="num" w:pos="1800"/>
+        </w:tabs>
+        <w:ind w:left="2160" w:hanging="360"/>
+      </w:pPr>
+      <w:rPr>
+        <w:rFonts w:ascii="Symbol" w:hAnsi="Symbol" w:hint="default"/>
+      </w:rPr>
+    </w:lvl>
+    <w:lvl w:ilvl="4">
+      <w:start w:val="1"/>
+      <w:numFmt w:val="bullet"/>
+      <w:lvlText w:val=""/>
+      <w:lvlJc w:val="left"/>
+      <w:pPr>
+        <w:tabs>
+          <w:tab w:val="num" w:pos="2160"/>
+        </w:tabs>
+        <w:ind w:left="2520" w:hanging="360"/>
+      </w:pPr>
+      <w:rPr>
+        <w:rFonts w:ascii="Symbol" w:hAnsi="Symbol" w:hint="default"/>
+      </w:rPr>
+    </w:lvl>
+    <w:lvl w:ilvl="5">
+      <w:start w:val="1"/>
+      <w:numFmt w:val="bullet"/>
+      <w:lvlText w:val=""/>
+      <w:lvlJc w:val="left"/>
+      <w:pPr>
+        <w:tabs>
+          <w:tab w:val="num" w:pos="2520"/>
+        </w:tabs>
+        <w:ind w:left="2880" w:hanging="360"/>
+      </w:pPr>
+      <w:rPr>
+        <w:rFonts w:ascii="Wingdings" w:hAnsi="Wingdings" w:hint="default"/>
+      </w:rPr>
+    </w:lvl>
+    <w:lvl w:ilvl="6">
+      <w:start w:val="1"/>
+      <w:numFmt w:val="bullet"/>
+      <w:lvlText w:val=""/>
+      <w:lvlJc w:val="left"/>
+      <w:pPr>
+        <w:tabs>
+          <w:tab w:val="num" w:pos="2880"/>
+        </w:tabs>
+        <w:ind w:left="3240" w:hanging="360"/>
+      </w:pPr>
+      <w:rPr>
+        <w:rFonts w:ascii="Wingdings" w:hAnsi="Wingdings" w:hint="default"/>
+      </w:rPr>
+    </w:lvl>
+    <w:lvl w:ilvl="7">
+      <w:start w:val="1"/>
+      <w:numFmt w:val="bullet"/>
+      <w:lvlText w:val=""/>
+      <w:lvlJc w:val="left"/>
+      <w:pPr>
+        <w:tabs>
+          <w:tab w:val="num" w:pos="3240"/>
+        </w:tabs>
+        <w:ind w:left="3600" w:hanging="360"/>
+      </w:pPr>
+      <w:rPr>
+        <w:rFonts w:ascii="Symbol" w:hAnsi="Symbol" w:hint="default"/>
+      </w:rPr>
+    </w:lvl>
+    <w:lvl w:ilvl="8">
+      <w:start w:val="1"/>
+      <w:numFmt w:val="bullet"/>
+      <w:lvlText w:val=""/>
+      <w:lvlJc w:val="left"/>
+      <w:pPr>
+        <w:tabs>
+          <w:tab w:val="num" w:pos="3600"/>
+        </w:tabs>
+        <w:ind w:left="3960" w:hanging="360"/>
+      </w:pPr>
+      <w:rPr>
+        <w:rFonts w:ascii="Symbol" w:hAnsi="Symbol" w:hint="default"/>
+      </w:rPr>
+    </w:lvl>
+  </w:abstractNum>
+  <w:abstractNum w:abstractNumId="3" w15:restartNumberingAfterBreak="0">
     <w:nsid w:val="2AC617E3"/>
     <w:multiLevelType w:val="hybridMultilevel"/>
     <w:tmpl w:val="F4BA30F6"/>
@@ -949,7 +1284,7 @@
       </w:pPr>
     </w:lvl>
   </w:abstractNum>
-  <w:abstractNum w:abstractNumId="3" w15:restartNumberingAfterBreak="0">
+  <w:abstractNum w:abstractNumId="4" w15:restartNumberingAfterBreak="0">
     <w:nsid w:val="4526136F"/>
     <w:multiLevelType w:val="hybridMultilevel"/>
     <w:tmpl w:val="9FE21C52"/>
@@ -1035,7 +1370,7 @@
       </w:pPr>
     </w:lvl>
   </w:abstractNum>
-  <w:abstractNum w:abstractNumId="4" w15:restartNumberingAfterBreak="0">
+  <w:abstractNum w:abstractNumId="5" w15:restartNumberingAfterBreak="0">
     <w:nsid w:val="493C420D"/>
     <w:multiLevelType w:val="hybridMultilevel"/>
     <w:tmpl w:val="D04A1C7C"/>
@@ -1124,7 +1459,7 @@
       </w:pPr>
     </w:lvl>
   </w:abstractNum>
-  <w:abstractNum w:abstractNumId="5" w15:restartNumberingAfterBreak="0">
+  <w:abstractNum w:abstractNumId="6" w15:restartNumberingAfterBreak="0">
     <w:nsid w:val="6B155668"/>
     <w:multiLevelType w:val="multilevel"/>
     <w:tmpl w:val="1B0E3442"/>
@@ -1185,19 +1520,22 @@
     <w:abstractNumId w:val="0"/>
   </w:num>
   <w:num w:numId="2" w16cid:durableId="649793368">
-    <w:abstractNumId w:val="3"/>
+    <w:abstractNumId w:val="4"/>
   </w:num>
   <w:num w:numId="3" w16cid:durableId="2084183876">
-    <w:abstractNumId w:val="5"/>
+    <w:abstractNumId w:val="6"/>
   </w:num>
   <w:num w:numId="4" w16cid:durableId="1105729842">
     <w:abstractNumId w:val="1"/>
   </w:num>
   <w:num w:numId="5" w16cid:durableId="292490582">
-    <w:abstractNumId w:val="2"/>
+    <w:abstractNumId w:val="3"/>
   </w:num>
   <w:num w:numId="6" w16cid:durableId="1206017412">
-    <w:abstractNumId w:val="4"/>
+    <w:abstractNumId w:val="5"/>
+  </w:num>
+  <w:num w:numId="7" w16cid:durableId="140463315">
+    <w:abstractNumId w:val="2"/>
   </w:num>
 </w:numbering>
 </file>
@@ -1266,7 +1604,7 @@
     <w:lsdException w:name="macro" w:semiHidden="1" w:unhideWhenUsed="1"/>
     <w:lsdException w:name="toa heading" w:semiHidden="1" w:unhideWhenUsed="1"/>
     <w:lsdException w:name="List" w:semiHidden="1" w:unhideWhenUsed="1"/>
-    <w:lsdException w:name="List Bullet" w:semiHidden="1" w:unhideWhenUsed="1"/>
+    <w:lsdException w:name="List Bullet" w:semiHidden="1" w:unhideWhenUsed="1" w:qFormat="1"/>
     <w:lsdException w:name="List Number" w:semiHidden="1" w:unhideWhenUsed="1"/>
     <w:lsdException w:name="List 2" w:semiHidden="1" w:unhideWhenUsed="1"/>
     <w:lsdException w:name="List 3" w:semiHidden="1" w:unhideWhenUsed="1"/>
@@ -2109,6 +2447,30 @@
       <w:spacing w:val="5"/>
     </w:rPr>
   </w:style>
+  <w:style w:type="paragraph" w:styleId="ListBullet">
+    <w:name w:val="List Bullet"/>
+    <w:basedOn w:val="Normal"/>
+    <w:uiPriority w:val="99"/>
+    <w:qFormat/>
+    <w:rsid w:val="001A23DC"/>
+    <w:pPr>
+      <w:numPr>
+        <w:numId w:val="7"/>
+      </w:numPr>
+      <w:tabs>
+        <w:tab w:val="clear" w:pos="720"/>
+      </w:tabs>
+      <w:spacing w:before="40" w:after="40" w:line="276" w:lineRule="auto"/>
+      <w:ind w:left="0" w:firstLine="0"/>
+    </w:pPr>
+    <w:rPr>
+      <w:rFonts w:eastAsia="Times New Roman"/>
+      <w:kern w:val="0"/>
+      <w:sz w:val="20"/>
+      <w:szCs w:val="20"/>
+      <w14:ligatures w14:val="none"/>
+    </w:rPr>
+  </w:style>
 </w:styles>
 </file>
 

</xml_diff>